<commit_message>
Apostila SD CBMBA: paleta amarelo e preto do Projeto Gabaritando
Co-Authored-By: Claude Opus 5.5 <noreply@anthropic.com>
Claude-Session: https://claude.ai/code/session_01GBJJsYm8yWBG7dqwHbJSGD
</commit_message>
<xml_diff>
--- a/saidas/sd-cbmba/ciencias-naturais/pdf/01_visao_unificada_do_mundo_fisico_quimico_e_biologico.docx
+++ b/saidas/sd-cbmba/ciencias-naturais/pdf/01_visao_unificada_do_mundo_fisico_quimico_e_biologico.docx
@@ -57,7 +57,7 @@
         <w:rPr>
           <w:b/>
           <w:i w:val="0"/>
-          <w:color w:val="B8862B"/>
+          <w:color w:val="FDB404"/>
           <w:sz w:val="22"/>
         </w:rPr>
         <w:t>VEM GABARITAR COM A GENTE</w:t>
@@ -72,26 +72,49 @@
         <w:rPr>
           <w:b/>
           <w:i w:val="0"/>
-          <w:color w:val="1B2A4A"/>
+          <w:color w:val="111111"/>
           <w:sz w:val="60"/>
         </w:rPr>
         <w:t>APOSTILA</w:t>
       </w:r>
     </w:p>
+    <w:tbl>
+      <w:tblPr>
+        <w:tblW w:type="auto" w:w="0"/>
+        <w:jc w:val="center"/>
+        <w:tblLook w:firstColumn="1" w:firstRow="1" w:lastColumn="0" w:lastRow="0" w:noHBand="0" w:noVBand="1" w:val="04A0"/>
+      </w:tblPr>
+      <w:tblGrid>
+        <w:gridCol w:w="9638"/>
+      </w:tblGrid>
+      <w:tr>
+        <w:tc>
+          <w:tcPr>
+            <w:tcW w:type="dxa" w:w="9638"/>
+            <w:shd w:val="clear" w:color="auto" w:fill="111111"/>
+          </w:tcPr>
+          <w:p>
+            <w:pPr>
+              <w:jc w:val="center"/>
+            </w:pPr>
+            <w:r>
+              <w:rPr>
+                <w:b/>
+                <w:i w:val="0"/>
+                <w:color w:val="FDB404"/>
+                <w:sz w:val="36"/>
+              </w:rPr>
+              <w:t>CIÊNCIAS NATURAIS</w:t>
+            </w:r>
+          </w:p>
+        </w:tc>
+      </w:tr>
+    </w:tbl>
     <w:p>
       <w:pPr>
         <w:spacing w:before="0" w:after="280"/>
-        <w:jc w:val="center"/>
+        <w:jc w:val="both"/>
       </w:pPr>
-      <w:r>
-        <w:rPr>
-          <w:b/>
-          <w:i w:val="0"/>
-          <w:color w:val="B8862B"/>
-          <w:sz w:val="36"/>
-        </w:rPr>
-        <w:t>CIÊNCIAS NATURAIS</w:t>
-      </w:r>
     </w:p>
     <w:p>
       <w:pPr>
@@ -102,7 +125,7 @@
         <w:rPr>
           <w:b/>
           <w:i w:val="0"/>
-          <w:color w:val="1B2A4A"/>
+          <w:color w:val="111111"/>
           <w:sz w:val="30"/>
         </w:rPr>
         <w:t>VISÃO UNIFICADA DO MUNDO FÍSICO, QUÍMICO E BIOLÓGICO</w:t>
@@ -117,7 +140,7 @@
         <w:rPr>
           <w:b/>
           <w:i w:val="0"/>
-          <w:color w:val="1B2A4A"/>
+          <w:color w:val="111111"/>
           <w:sz w:val="28"/>
         </w:rPr>
         <w:t>Corpo de Bombeiros Militar da Bahia</w:t>
@@ -147,7 +170,7 @@
         <w:rPr>
           <w:b/>
           <w:i/>
-          <w:color w:val="1B2A4A"/>
+          <w:color w:val="111111"/>
           <w:sz w:val="24"/>
         </w:rPr>
         <w:t>“O crescimento mora no desconforto.”</w:t>
@@ -192,14 +215,14 @@
         <w:tc>
           <w:tcPr>
             <w:tcW w:type="dxa" w:w="9638"/>
-            <w:shd w:val="clear" w:color="auto" w:fill="1B2A4A"/>
+            <w:shd w:val="clear" w:color="auto" w:fill="111111"/>
           </w:tcPr>
           <w:p>
             <w:r>
               <w:rPr>
                 <w:b/>
                 <w:i w:val="0"/>
-                <w:color w:val="FFFFFF"/>
+                <w:color w:val="FDB404"/>
                 <w:sz w:val="26"/>
               </w:rPr>
               <w:t>📖 PREFÁCIO</w:t>
@@ -232,7 +255,7 @@
         <w:rPr>
           <w:b/>
           <w:i w:val="0"/>
-          <w:color w:val="1B2A4A"/>
+          <w:color w:val="111111"/>
           <w:sz w:val="21"/>
         </w:rPr>
         <w:t>reação química</w:t>
@@ -250,7 +273,7 @@
         <w:rPr>
           <w:b/>
           <w:i w:val="0"/>
-          <w:color w:val="1B2A4A"/>
+          <w:color w:val="111111"/>
           <w:sz w:val="21"/>
         </w:rPr>
         <w:t>transferência de calor</w:t>
@@ -268,7 +291,7 @@
         <w:rPr>
           <w:b/>
           <w:i w:val="0"/>
-          <w:color w:val="1B2A4A"/>
+          <w:color w:val="111111"/>
           <w:sz w:val="21"/>
         </w:rPr>
         <w:t>vida</w:t>
@@ -302,14 +325,14 @@
         <w:tc>
           <w:tcPr>
             <w:tcW w:type="dxa" w:w="9638"/>
-            <w:shd w:val="clear" w:color="auto" w:fill="1B2A4A"/>
+            <w:shd w:val="clear" w:color="auto" w:fill="111111"/>
           </w:tcPr>
           <w:p>
             <w:r>
               <w:rPr>
                 <w:b/>
                 <w:i w:val="0"/>
-                <w:color w:val="FFFFFF"/>
+                <w:color w:val="FDB404"/>
                 <w:sz w:val="26"/>
               </w:rPr>
               <w:t>🎯 INTRODUÇÃO AO TEMA</w:t>
@@ -342,7 +365,7 @@
         <w:rPr>
           <w:b/>
           <w:i w:val="0"/>
-          <w:color w:val="1B2A4A"/>
+          <w:color w:val="111111"/>
           <w:sz w:val="21"/>
         </w:rPr>
         <w:t>matéria</w:t>
@@ -360,7 +383,7 @@
         <w:rPr>
           <w:b/>
           <w:i w:val="0"/>
-          <w:color w:val="1B2A4A"/>
+          <w:color w:val="111111"/>
           <w:sz w:val="21"/>
         </w:rPr>
         <w:t>energia</w:t>
@@ -378,7 +401,7 @@
         <w:rPr>
           <w:b/>
           <w:i w:val="0"/>
-          <w:color w:val="1B2A4A"/>
+          <w:color w:val="111111"/>
           <w:sz w:val="21"/>
         </w:rPr>
         <w:t>seres vivos</w:t>
@@ -403,7 +426,7 @@
         <w:rPr>
           <w:b/>
           <w:i w:val="0"/>
-          <w:color w:val="B8862B"/>
+          <w:color w:val="C98F00"/>
           <w:sz w:val="20"/>
         </w:rPr>
         <w:t xml:space="preserve">▸ </w:t>
@@ -421,7 +444,7 @@
         <w:rPr>
           <w:b/>
           <w:i w:val="0"/>
-          <w:color w:val="1B2A4A"/>
+          <w:color w:val="111111"/>
           <w:sz w:val="21"/>
         </w:rPr>
         <w:t>Física</w:t>
@@ -446,7 +469,7 @@
         <w:rPr>
           <w:b/>
           <w:i w:val="0"/>
-          <w:color w:val="B8862B"/>
+          <w:color w:val="C98F00"/>
           <w:sz w:val="20"/>
         </w:rPr>
         <w:t xml:space="preserve">▸ </w:t>
@@ -464,7 +487,7 @@
         <w:rPr>
           <w:b/>
           <w:i w:val="0"/>
-          <w:color w:val="1B2A4A"/>
+          <w:color w:val="111111"/>
           <w:sz w:val="21"/>
         </w:rPr>
         <w:t>Química</w:t>
@@ -489,7 +512,7 @@
         <w:rPr>
           <w:b/>
           <w:i w:val="0"/>
-          <w:color w:val="B8862B"/>
+          <w:color w:val="C98F00"/>
           <w:sz w:val="20"/>
         </w:rPr>
         <w:t xml:space="preserve">▸ </w:t>
@@ -507,7 +530,7 @@
         <w:rPr>
           <w:b/>
           <w:i w:val="0"/>
-          <w:color w:val="1B2A4A"/>
+          <w:color w:val="111111"/>
           <w:sz w:val="21"/>
         </w:rPr>
         <w:t>Biologia</w:t>
@@ -540,7 +563,7 @@
         <w:rPr>
           <w:b/>
           <w:i w:val="0"/>
-          <w:color w:val="1B2A4A"/>
+          <w:color w:val="111111"/>
           <w:sz w:val="21"/>
         </w:rPr>
         <w:t>visão unificada</w:t>
@@ -579,14 +602,14 @@
         <w:tc>
           <w:tcPr>
             <w:tcW w:type="dxa" w:w="9638"/>
-            <w:shd w:val="clear" w:color="auto" w:fill="1B2A4A"/>
+            <w:shd w:val="clear" w:color="auto" w:fill="111111"/>
           </w:tcPr>
           <w:p>
             <w:r>
               <w:rPr>
                 <w:b/>
                 <w:i w:val="0"/>
-                <w:color w:val="FFFFFF"/>
+                <w:color w:val="FDB404"/>
                 <w:sz w:val="26"/>
               </w:rPr>
               <w:t>🧠 DESENVOLVIMENTO TEÓRICO</w:t>
@@ -610,7 +633,16 @@
         <w:rPr>
           <w:b/>
           <w:i w:val="0"/>
-          <w:color w:val="B8862B"/>
+          <w:color w:val="FDB404"/>
+          <w:sz w:val="25"/>
+        </w:rPr>
+        <w:t xml:space="preserve">■ </w:t>
+      </w:r>
+      <w:r>
+        <w:rPr>
+          <w:b/>
+          <w:i w:val="0"/>
+          <w:color w:val="111111"/>
           <w:sz w:val="25"/>
         </w:rPr>
         <w:t>1. Matéria e Energia: os Dois Pilares</w:t>
@@ -625,7 +657,7 @@
         <w:rPr>
           <w:b/>
           <w:i w:val="0"/>
-          <w:color w:val="1B2A4A"/>
+          <w:color w:val="111111"/>
           <w:sz w:val="21"/>
         </w:rPr>
         <w:t>Matéria</w:t>
@@ -643,7 +675,7 @@
         <w:rPr>
           <w:b/>
           <w:i w:val="0"/>
-          <w:color w:val="1B2A4A"/>
+          <w:color w:val="111111"/>
           <w:sz w:val="21"/>
         </w:rPr>
         <w:t>átomos</w:t>
@@ -661,7 +693,7 @@
         <w:rPr>
           <w:b/>
           <w:i w:val="0"/>
-          <w:color w:val="1B2A4A"/>
+          <w:color w:val="111111"/>
           <w:sz w:val="21"/>
         </w:rPr>
         <w:t>moléculas</w:t>
@@ -685,7 +717,7 @@
         <w:rPr>
           <w:b/>
           <w:i w:val="0"/>
-          <w:color w:val="1B2A4A"/>
+          <w:color w:val="111111"/>
           <w:sz w:val="21"/>
         </w:rPr>
         <w:t>Energia</w:t>
@@ -721,7 +753,7 @@
               <w:rPr>
                 <w:b/>
                 <w:i w:val="0"/>
-                <w:color w:val="1B2A4A"/>
+                <w:color w:val="111111"/>
                 <w:sz w:val="19"/>
               </w:rPr>
               <w:t>Cinética</w:t>
@@ -749,14 +781,14 @@
         <w:tc>
           <w:tcPr>
             <w:tcW w:type="dxa" w:w="4819"/>
-            <w:shd w:val="clear" w:color="auto" w:fill="E8EDF5"/>
+            <w:shd w:val="clear" w:color="auto" w:fill="F2F2F2"/>
           </w:tcPr>
           <w:p>
             <w:r>
               <w:rPr>
                 <w:b/>
                 <w:i w:val="0"/>
-                <w:color w:val="1B2A4A"/>
+                <w:color w:val="111111"/>
                 <w:sz w:val="19"/>
               </w:rPr>
               <w:t>Potencial (gravitacional, elástica)</w:t>
@@ -766,7 +798,7 @@
         <w:tc>
           <w:tcPr>
             <w:tcW w:type="dxa" w:w="4819"/>
-            <w:shd w:val="clear" w:color="auto" w:fill="E8EDF5"/>
+            <w:shd w:val="clear" w:color="auto" w:fill="F2F2F2"/>
           </w:tcPr>
           <w:p>
             <w:r>
@@ -791,7 +823,7 @@
               <w:rPr>
                 <w:b/>
                 <w:i w:val="0"/>
-                <w:color w:val="1B2A4A"/>
+                <w:color w:val="111111"/>
                 <w:sz w:val="19"/>
               </w:rPr>
               <w:t>Térmica</w:t>
@@ -819,14 +851,14 @@
         <w:tc>
           <w:tcPr>
             <w:tcW w:type="dxa" w:w="4819"/>
-            <w:shd w:val="clear" w:color="auto" w:fill="E8EDF5"/>
+            <w:shd w:val="clear" w:color="auto" w:fill="F2F2F2"/>
           </w:tcPr>
           <w:p>
             <w:r>
               <w:rPr>
                 <w:b/>
                 <w:i w:val="0"/>
-                <w:color w:val="1B2A4A"/>
+                <w:color w:val="111111"/>
                 <w:sz w:val="19"/>
               </w:rPr>
               <w:t>Química</w:t>
@@ -836,7 +868,7 @@
         <w:tc>
           <w:tcPr>
             <w:tcW w:type="dxa" w:w="4819"/>
-            <w:shd w:val="clear" w:color="auto" w:fill="E8EDF5"/>
+            <w:shd w:val="clear" w:color="auto" w:fill="F2F2F2"/>
           </w:tcPr>
           <w:p>
             <w:r>
@@ -861,7 +893,7 @@
               <w:rPr>
                 <w:b/>
                 <w:i w:val="0"/>
-                <w:color w:val="1B2A4A"/>
+                <w:color w:val="111111"/>
                 <w:sz w:val="19"/>
               </w:rPr>
               <w:t>Elétrica</w:t>
@@ -889,14 +921,14 @@
         <w:tc>
           <w:tcPr>
             <w:tcW w:type="dxa" w:w="4819"/>
-            <w:shd w:val="clear" w:color="auto" w:fill="E8EDF5"/>
+            <w:shd w:val="clear" w:color="auto" w:fill="F2F2F2"/>
           </w:tcPr>
           <w:p>
             <w:r>
               <w:rPr>
                 <w:b/>
                 <w:i w:val="0"/>
-                <w:color w:val="1B2A4A"/>
+                <w:color w:val="111111"/>
                 <w:sz w:val="19"/>
               </w:rPr>
               <w:t>Luminosa (radiante)</w:t>
@@ -906,7 +938,7 @@
         <w:tc>
           <w:tcPr>
             <w:tcW w:type="dxa" w:w="4819"/>
-            <w:shd w:val="clear" w:color="auto" w:fill="E8EDF5"/>
+            <w:shd w:val="clear" w:color="auto" w:fill="F2F2F2"/>
           </w:tcPr>
           <w:p>
             <w:r>
@@ -931,7 +963,7 @@
               <w:rPr>
                 <w:b/>
                 <w:i w:val="0"/>
-                <w:color w:val="1B2A4A"/>
+                <w:color w:val="111111"/>
                 <w:sz w:val="19"/>
               </w:rPr>
               <w:t>Nuclear</w:t>
@@ -971,7 +1003,16 @@
         <w:rPr>
           <w:b/>
           <w:i w:val="0"/>
-          <w:color w:val="B8862B"/>
+          <w:color w:val="FDB404"/>
+          <w:sz w:val="25"/>
+        </w:rPr>
+        <w:t xml:space="preserve">■ </w:t>
+      </w:r>
+      <w:r>
+        <w:rPr>
+          <w:b/>
+          <w:i w:val="0"/>
+          <w:color w:val="111111"/>
           <w:sz w:val="25"/>
         </w:rPr>
         <w:t>2. Princípios que Unificam as Ciências</w:t>
@@ -986,7 +1027,7 @@
         <w:rPr>
           <w:b/>
           <w:i w:val="0"/>
-          <w:color w:val="1B2A4A"/>
+          <w:color w:val="111111"/>
           <w:sz w:val="22"/>
         </w:rPr>
         <w:t>2.1 Conservação da Energia</w:t>
@@ -1017,7 +1058,7 @@
         <w:rPr>
           <w:b/>
           <w:i w:val="0"/>
-          <w:color w:val="B8862B"/>
+          <w:color w:val="C98F00"/>
           <w:sz w:val="20"/>
         </w:rPr>
         <w:t xml:space="preserve">▸ </w:t>
@@ -1026,7 +1067,7 @@
         <w:rPr>
           <w:b/>
           <w:i w:val="0"/>
-          <w:color w:val="1B2A4A"/>
+          <w:color w:val="111111"/>
           <w:sz w:val="21"/>
         </w:rPr>
         <w:t>Física:</w:t>
@@ -1051,7 +1092,7 @@
         <w:rPr>
           <w:b/>
           <w:i w:val="0"/>
-          <w:color w:val="B8862B"/>
+          <w:color w:val="C98F00"/>
           <w:sz w:val="20"/>
         </w:rPr>
         <w:t xml:space="preserve">▸ </w:t>
@@ -1060,7 +1101,7 @@
         <w:rPr>
           <w:b/>
           <w:i w:val="0"/>
-          <w:color w:val="1B2A4A"/>
+          <w:color w:val="111111"/>
           <w:sz w:val="21"/>
         </w:rPr>
         <w:t>Química:</w:t>
@@ -1085,7 +1126,7 @@
         <w:rPr>
           <w:b/>
           <w:i w:val="0"/>
-          <w:color w:val="B8862B"/>
+          <w:color w:val="C98F00"/>
           <w:sz w:val="20"/>
         </w:rPr>
         <w:t xml:space="preserve">▸ </w:t>
@@ -1094,7 +1135,7 @@
         <w:rPr>
           <w:b/>
           <w:i w:val="0"/>
-          <w:color w:val="1B2A4A"/>
+          <w:color w:val="111111"/>
           <w:sz w:val="21"/>
         </w:rPr>
         <w:t>Biologia:</w:t>
@@ -1118,7 +1159,7 @@
         <w:rPr>
           <w:b/>
           <w:i w:val="0"/>
-          <w:color w:val="1B2A4A"/>
+          <w:color w:val="111111"/>
           <w:sz w:val="22"/>
         </w:rPr>
         <w:t>2.2 Conservação da Massa (Lavoisier)</w:t>
@@ -1148,7 +1189,7 @@
         <w:rPr>
           <w:b/>
           <w:i w:val="0"/>
-          <w:color w:val="1B2A4A"/>
+          <w:color w:val="111111"/>
           <w:sz w:val="22"/>
         </w:rPr>
         <w:t>2.3 Teoria Celular e Unidade da Vida</w:t>
@@ -1172,7 +1213,7 @@
         <w:rPr>
           <w:b/>
           <w:i w:val="0"/>
-          <w:color w:val="1B2A4A"/>
+          <w:color w:val="111111"/>
           <w:sz w:val="21"/>
         </w:rPr>
         <w:t>células</w:t>
@@ -1190,7 +1231,7 @@
         <w:rPr>
           <w:b/>
           <w:i w:val="0"/>
-          <w:color w:val="1B2A4A"/>
+          <w:color w:val="111111"/>
           <w:sz w:val="21"/>
         </w:rPr>
         <w:t>unidade</w:t>
@@ -1208,7 +1249,7 @@
         <w:rPr>
           <w:b/>
           <w:i w:val="0"/>
-          <w:color w:val="1B2A4A"/>
+          <w:color w:val="111111"/>
           <w:sz w:val="21"/>
         </w:rPr>
         <w:t>diversidade</w:t>
@@ -1232,7 +1273,7 @@
         <w:rPr>
           <w:b/>
           <w:i w:val="0"/>
-          <w:color w:val="1B2A4A"/>
+          <w:color w:val="111111"/>
           <w:sz w:val="22"/>
         </w:rPr>
         <w:t>2.4 Os Fluxos na Natureza</w:t>
@@ -1248,7 +1289,7 @@
         <w:rPr>
           <w:b/>
           <w:i w:val="0"/>
-          <w:color w:val="B8862B"/>
+          <w:color w:val="C98F00"/>
           <w:sz w:val="20"/>
         </w:rPr>
         <w:t xml:space="preserve">▸ </w:t>
@@ -1257,7 +1298,7 @@
         <w:rPr>
           <w:b/>
           <w:i w:val="0"/>
-          <w:color w:val="1B2A4A"/>
+          <w:color w:val="111111"/>
           <w:sz w:val="21"/>
         </w:rPr>
         <w:t>A energia flui</w:t>
@@ -1282,7 +1323,7 @@
         <w:rPr>
           <w:b/>
           <w:i w:val="0"/>
-          <w:color w:val="B8862B"/>
+          <w:color w:val="C98F00"/>
           <w:sz w:val="20"/>
         </w:rPr>
         <w:t xml:space="preserve">▸ </w:t>
@@ -1291,7 +1332,7 @@
         <w:rPr>
           <w:b/>
           <w:i w:val="0"/>
-          <w:color w:val="1B2A4A"/>
+          <w:color w:val="111111"/>
           <w:sz w:val="21"/>
         </w:rPr>
         <w:t>A matéria circula</w:t>
@@ -1315,7 +1356,16 @@
         <w:rPr>
           <w:b/>
           <w:i w:val="0"/>
-          <w:color w:val="B8862B"/>
+          <w:color w:val="FDB404"/>
+          <w:sz w:val="25"/>
+        </w:rPr>
+        <w:t xml:space="preserve">■ </w:t>
+      </w:r>
+      <w:r>
+        <w:rPr>
+          <w:b/>
+          <w:i w:val="0"/>
+          <w:color w:val="111111"/>
           <w:sz w:val="25"/>
         </w:rPr>
         <w:t>3. Fenômenos Físicos x Fenômenos Químicos</w:t>
@@ -1343,7 +1393,7 @@
               <w:rPr>
                 <w:b/>
                 <w:i w:val="0"/>
-                <w:color w:val="1B2A4A"/>
+                <w:color w:val="111111"/>
                 <w:sz w:val="19"/>
               </w:rPr>
               <w:t>Fenômeno físico</w:t>
@@ -1387,14 +1437,14 @@
         <w:tc>
           <w:tcPr>
             <w:tcW w:type="dxa" w:w="3213"/>
-            <w:shd w:val="clear" w:color="auto" w:fill="E8EDF5"/>
+            <w:shd w:val="clear" w:color="auto" w:fill="F2F2F2"/>
           </w:tcPr>
           <w:p>
             <w:r>
               <w:rPr>
                 <w:b/>
                 <w:i w:val="0"/>
-                <w:color w:val="1B2A4A"/>
+                <w:color w:val="111111"/>
                 <w:sz w:val="19"/>
               </w:rPr>
               <w:t>Fenômeno químico</w:t>
@@ -1404,7 +1454,7 @@
         <w:tc>
           <w:tcPr>
             <w:tcW w:type="dxa" w:w="3213"/>
-            <w:shd w:val="clear" w:color="auto" w:fill="E8EDF5"/>
+            <w:shd w:val="clear" w:color="auto" w:fill="F2F2F2"/>
           </w:tcPr>
           <w:p>
             <w:r>
@@ -1421,7 +1471,7 @@
         <w:tc>
           <w:tcPr>
             <w:tcW w:type="dxa" w:w="3213"/>
-            <w:shd w:val="clear" w:color="auto" w:fill="E8EDF5"/>
+            <w:shd w:val="clear" w:color="auto" w:fill="F2F2F2"/>
           </w:tcPr>
           <w:p>
             <w:r>
@@ -1467,7 +1517,16 @@
         <w:rPr>
           <w:b/>
           <w:i w:val="0"/>
-          <w:color w:val="B8862B"/>
+          <w:color w:val="FDB404"/>
+          <w:sz w:val="25"/>
+        </w:rPr>
+        <w:t xml:space="preserve">■ </w:t>
+      </w:r>
+      <w:r>
+        <w:rPr>
+          <w:b/>
+          <w:i w:val="0"/>
+          <w:color w:val="111111"/>
           <w:sz w:val="25"/>
         </w:rPr>
         <w:t>4. Integração na Prática: o Fogo</w:t>
@@ -1491,7 +1550,7 @@
         <w:rPr>
           <w:b/>
           <w:i w:val="0"/>
-          <w:color w:val="1B2A4A"/>
+          <w:color w:val="111111"/>
           <w:sz w:val="21"/>
         </w:rPr>
         <w:t>triângulo do fogo</w:t>
@@ -1509,7 +1568,7 @@
         <w:rPr>
           <w:b/>
           <w:i w:val="0"/>
-          <w:color w:val="1B2A4A"/>
+          <w:color w:val="111111"/>
           <w:sz w:val="21"/>
         </w:rPr>
         <w:t>tetraedro do fogo</w:t>
@@ -1545,7 +1604,7 @@
               <w:rPr>
                 <w:b/>
                 <w:i w:val="0"/>
-                <w:color w:val="1B2A4A"/>
+                <w:color w:val="111111"/>
                 <w:sz w:val="19"/>
               </w:rPr>
               <w:t>Combustível</w:t>
@@ -1573,14 +1632,14 @@
         <w:tc>
           <w:tcPr>
             <w:tcW w:type="dxa" w:w="4819"/>
-            <w:shd w:val="clear" w:color="auto" w:fill="E8EDF5"/>
+            <w:shd w:val="clear" w:color="auto" w:fill="F2F2F2"/>
           </w:tcPr>
           <w:p>
             <w:r>
               <w:rPr>
                 <w:b/>
                 <w:i w:val="0"/>
-                <w:color w:val="1B2A4A"/>
+                <w:color w:val="111111"/>
                 <w:sz w:val="19"/>
               </w:rPr>
               <w:t>Comburente</w:t>
@@ -1590,7 +1649,7 @@
         <w:tc>
           <w:tcPr>
             <w:tcW w:type="dxa" w:w="4819"/>
-            <w:shd w:val="clear" w:color="auto" w:fill="E8EDF5"/>
+            <w:shd w:val="clear" w:color="auto" w:fill="F2F2F2"/>
           </w:tcPr>
           <w:p>
             <w:r>
@@ -1615,7 +1674,7 @@
               <w:rPr>
                 <w:b/>
                 <w:i w:val="0"/>
-                <w:color w:val="1B2A4A"/>
+                <w:color w:val="111111"/>
                 <w:sz w:val="19"/>
               </w:rPr>
               <w:t>Calor</w:t>
@@ -1643,14 +1702,14 @@
         <w:tc>
           <w:tcPr>
             <w:tcW w:type="dxa" w:w="4819"/>
-            <w:shd w:val="clear" w:color="auto" w:fill="E8EDF5"/>
+            <w:shd w:val="clear" w:color="auto" w:fill="F2F2F2"/>
           </w:tcPr>
           <w:p>
             <w:r>
               <w:rPr>
                 <w:b/>
                 <w:i w:val="0"/>
-                <w:color w:val="1B2A4A"/>
+                <w:color w:val="111111"/>
                 <w:sz w:val="19"/>
               </w:rPr>
               <w:t>Reação em cadeia</w:t>
@@ -1660,7 +1719,7 @@
         <w:tc>
           <w:tcPr>
             <w:tcW w:type="dxa" w:w="4819"/>
-            <w:shd w:val="clear" w:color="auto" w:fill="E8EDF5"/>
+            <w:shd w:val="clear" w:color="auto" w:fill="F2F2F2"/>
           </w:tcPr>
           <w:p>
             <w:r>
@@ -1718,7 +1777,7 @@
               <w:rPr>
                 <w:b/>
                 <w:i w:val="0"/>
-                <w:color w:val="1B2A4A"/>
+                <w:color w:val="111111"/>
                 <w:sz w:val="19"/>
               </w:rPr>
               <w:t>Resfriamento</w:t>
@@ -1746,14 +1805,14 @@
         <w:tc>
           <w:tcPr>
             <w:tcW w:type="dxa" w:w="4819"/>
-            <w:shd w:val="clear" w:color="auto" w:fill="E8EDF5"/>
+            <w:shd w:val="clear" w:color="auto" w:fill="F2F2F2"/>
           </w:tcPr>
           <w:p>
             <w:r>
               <w:rPr>
                 <w:b/>
                 <w:i w:val="0"/>
-                <w:color w:val="1B2A4A"/>
+                <w:color w:val="111111"/>
                 <w:sz w:val="19"/>
               </w:rPr>
               <w:t>Abafamento</w:t>
@@ -1763,7 +1822,7 @@
         <w:tc>
           <w:tcPr>
             <w:tcW w:type="dxa" w:w="4819"/>
-            <w:shd w:val="clear" w:color="auto" w:fill="E8EDF5"/>
+            <w:shd w:val="clear" w:color="auto" w:fill="F2F2F2"/>
           </w:tcPr>
           <w:p>
             <w:r>
@@ -1788,7 +1847,7 @@
               <w:rPr>
                 <w:b/>
                 <w:i w:val="0"/>
-                <w:color w:val="1B2A4A"/>
+                <w:color w:val="111111"/>
                 <w:sz w:val="19"/>
               </w:rPr>
               <w:t>Isolamento (retirada do material)</w:t>
@@ -1816,14 +1875,14 @@
         <w:tc>
           <w:tcPr>
             <w:tcW w:type="dxa" w:w="4819"/>
-            <w:shd w:val="clear" w:color="auto" w:fill="E8EDF5"/>
+            <w:shd w:val="clear" w:color="auto" w:fill="F2F2F2"/>
           </w:tcPr>
           <w:p>
             <w:r>
               <w:rPr>
                 <w:b/>
                 <w:i w:val="0"/>
-                <w:color w:val="1B2A4A"/>
+                <w:color w:val="111111"/>
                 <w:sz w:val="19"/>
               </w:rPr>
               <w:t>Extinção química</w:t>
@@ -1833,7 +1892,7 @@
         <w:tc>
           <w:tcPr>
             <w:tcW w:type="dxa" w:w="4819"/>
-            <w:shd w:val="clear" w:color="auto" w:fill="E8EDF5"/>
+            <w:shd w:val="clear" w:color="auto" w:fill="F2F2F2"/>
           </w:tcPr>
           <w:p>
             <w:r>
@@ -1873,7 +1932,7 @@
         <w:rPr>
           <w:b/>
           <w:i w:val="0"/>
-          <w:color w:val="1B2A4A"/>
+          <w:color w:val="111111"/>
           <w:sz w:val="21"/>
         </w:rPr>
         <w:t>monóxido de carbono (CO)</w:t>
@@ -1897,7 +1956,16 @@
         <w:rPr>
           <w:b/>
           <w:i w:val="0"/>
-          <w:color w:val="B8862B"/>
+          <w:color w:val="FDB404"/>
+          <w:sz w:val="25"/>
+        </w:rPr>
+        <w:t xml:space="preserve">■ </w:t>
+      </w:r>
+      <w:r>
+        <w:rPr>
+          <w:b/>
+          <w:i w:val="0"/>
+          <w:color w:val="111111"/>
           <w:sz w:val="25"/>
         </w:rPr>
         <w:t>5. Corpo Humano: Física, Química e Biologia Juntas</w:t>
@@ -1913,7 +1981,7 @@
         <w:rPr>
           <w:b/>
           <w:i w:val="0"/>
-          <w:color w:val="B8862B"/>
+          <w:color w:val="C98F00"/>
           <w:sz w:val="20"/>
         </w:rPr>
         <w:t xml:space="preserve">▸ </w:t>
@@ -1922,7 +1990,7 @@
         <w:rPr>
           <w:b/>
           <w:i w:val="0"/>
-          <w:color w:val="1B2A4A"/>
+          <w:color w:val="111111"/>
           <w:sz w:val="21"/>
         </w:rPr>
         <w:t>Química:</w:t>
@@ -1947,7 +2015,7 @@
         <w:rPr>
           <w:b/>
           <w:i w:val="0"/>
-          <w:color w:val="B8862B"/>
+          <w:color w:val="C98F00"/>
           <w:sz w:val="20"/>
         </w:rPr>
         <w:t xml:space="preserve">▸ </w:t>
@@ -1956,7 +2024,7 @@
         <w:rPr>
           <w:b/>
           <w:i w:val="0"/>
-          <w:color w:val="1B2A4A"/>
+          <w:color w:val="111111"/>
           <w:sz w:val="21"/>
         </w:rPr>
         <w:t>Física:</w:t>
@@ -1981,7 +2049,7 @@
         <w:rPr>
           <w:b/>
           <w:i w:val="0"/>
-          <w:color w:val="B8862B"/>
+          <w:color w:val="C98F00"/>
           <w:sz w:val="20"/>
         </w:rPr>
         <w:t xml:space="preserve">▸ </w:t>
@@ -1990,7 +2058,7 @@
         <w:rPr>
           <w:b/>
           <w:i w:val="0"/>
-          <w:color w:val="1B2A4A"/>
+          <w:color w:val="111111"/>
           <w:sz w:val="21"/>
         </w:rPr>
         <w:t>Biologia:</w:t>
@@ -2024,14 +2092,14 @@
         <w:tc>
           <w:tcPr>
             <w:tcW w:type="dxa" w:w="9638"/>
-            <w:shd w:val="clear" w:color="auto" w:fill="1B2A4A"/>
+            <w:shd w:val="clear" w:color="auto" w:fill="111111"/>
           </w:tcPr>
           <w:p>
             <w:r>
               <w:rPr>
                 <w:b/>
                 <w:i w:val="0"/>
-                <w:color w:val="FFFFFF"/>
+                <w:color w:val="FDB404"/>
                 <w:sz w:val="26"/>
               </w:rPr>
               <w:t>📚 EXEMPLOS PRÁTICOS (COM INTERPRETAÇÃO GUIADA)</w:t>
@@ -2055,7 +2123,16 @@
         <w:rPr>
           <w:b/>
           <w:i w:val="0"/>
-          <w:color w:val="B8862B"/>
+          <w:color w:val="FDB404"/>
+          <w:sz w:val="21"/>
+        </w:rPr>
+        <w:t xml:space="preserve">■ </w:t>
+      </w:r>
+      <w:r>
+        <w:rPr>
+          <w:b/>
+          <w:i w:val="0"/>
+          <w:color w:val="111111"/>
           <w:sz w:val="21"/>
         </w:rPr>
         <w:t>Exemplo 1</w:t>
@@ -2094,7 +2171,7 @@
         <w:rPr>
           <w:b/>
           <w:i w:val="0"/>
-          <w:color w:val="1B2A4A"/>
+          <w:color w:val="111111"/>
           <w:sz w:val="21"/>
         </w:rPr>
         <w:t>Física</w:t>
@@ -2112,7 +2189,7 @@
         <w:rPr>
           <w:b/>
           <w:i w:val="0"/>
-          <w:color w:val="1B2A4A"/>
+          <w:color w:val="111111"/>
           <w:sz w:val="21"/>
         </w:rPr>
         <w:t>resfriamento</w:t>
@@ -2136,7 +2213,16 @@
         <w:rPr>
           <w:b/>
           <w:i w:val="0"/>
-          <w:color w:val="B8862B"/>
+          <w:color w:val="FDB404"/>
+          <w:sz w:val="21"/>
+        </w:rPr>
+        <w:t xml:space="preserve">■ </w:t>
+      </w:r>
+      <w:r>
+        <w:rPr>
+          <w:b/>
+          <w:i w:val="0"/>
+          <w:color w:val="111111"/>
           <w:sz w:val="21"/>
         </w:rPr>
         <w:t>Exemplo 2</w:t>
@@ -2175,7 +2261,7 @@
         <w:rPr>
           <w:b/>
           <w:i w:val="0"/>
-          <w:color w:val="1B2A4A"/>
+          <w:color w:val="111111"/>
           <w:sz w:val="21"/>
         </w:rPr>
         <w:t>CO₂ do ar</w:t>
@@ -2193,7 +2279,7 @@
         <w:rPr>
           <w:b/>
           <w:i w:val="0"/>
-          <w:color w:val="1B2A4A"/>
+          <w:color w:val="111111"/>
           <w:sz w:val="21"/>
         </w:rPr>
         <w:t>água</w:t>
@@ -2217,7 +2303,16 @@
         <w:rPr>
           <w:b/>
           <w:i w:val="0"/>
-          <w:color w:val="B8862B"/>
+          <w:color w:val="FDB404"/>
+          <w:sz w:val="21"/>
+        </w:rPr>
+        <w:t xml:space="preserve">■ </w:t>
+      </w:r>
+      <w:r>
+        <w:rPr>
+          <w:b/>
+          <w:i w:val="0"/>
+          <w:color w:val="111111"/>
           <w:sz w:val="21"/>
         </w:rPr>
         <w:t>Exemplo 3</w:t>
@@ -2256,7 +2351,7 @@
         <w:rPr>
           <w:b/>
           <w:i w:val="0"/>
-          <w:color w:val="1B2A4A"/>
+          <w:color w:val="111111"/>
           <w:sz w:val="21"/>
         </w:rPr>
         <w:t>evapora</w:t>
@@ -2290,14 +2385,14 @@
         <w:tc>
           <w:tcPr>
             <w:tcW w:type="dxa" w:w="9638"/>
-            <w:shd w:val="clear" w:color="auto" w:fill="1B2A4A"/>
+            <w:shd w:val="clear" w:color="auto" w:fill="111111"/>
           </w:tcPr>
           <w:p>
             <w:r>
               <w:rPr>
                 <w:b/>
                 <w:i w:val="0"/>
-                <w:color w:val="FFFFFF"/>
+                <w:color w:val="FDB404"/>
                 <w:sz w:val="26"/>
               </w:rPr>
               <w:t>💡 DICAS DE PROVA</w:t>
@@ -2322,7 +2417,7 @@
         <w:rPr>
           <w:b/>
           <w:i w:val="0"/>
-          <w:color w:val="B8862B"/>
+          <w:color w:val="C98F00"/>
           <w:sz w:val="20"/>
         </w:rPr>
         <w:t xml:space="preserve">▸ </w:t>
@@ -2340,7 +2435,7 @@
         <w:rPr>
           <w:b/>
           <w:i w:val="0"/>
-          <w:color w:val="1B2A4A"/>
+          <w:color w:val="111111"/>
           <w:sz w:val="21"/>
         </w:rPr>
         <w:t>composição</w:t>
@@ -2358,7 +2453,7 @@
         <w:rPr>
           <w:b/>
           <w:i w:val="0"/>
-          <w:color w:val="1B2A4A"/>
+          <w:color w:val="111111"/>
           <w:sz w:val="21"/>
         </w:rPr>
         <w:t>químico</w:t>
@@ -2376,7 +2471,7 @@
         <w:rPr>
           <w:b/>
           <w:i w:val="0"/>
-          <w:color w:val="1B2A4A"/>
+          <w:color w:val="111111"/>
           <w:sz w:val="21"/>
         </w:rPr>
         <w:t>forma ou o estado</w:t>
@@ -2394,7 +2489,7 @@
         <w:rPr>
           <w:b/>
           <w:i w:val="0"/>
-          <w:color w:val="1B2A4A"/>
+          <w:color w:val="111111"/>
           <w:sz w:val="21"/>
         </w:rPr>
         <w:t>físico</w:t>
@@ -2419,7 +2514,7 @@
         <w:rPr>
           <w:b/>
           <w:i w:val="0"/>
-          <w:color w:val="B8862B"/>
+          <w:color w:val="C98F00"/>
           <w:sz w:val="20"/>
         </w:rPr>
         <w:t xml:space="preserve">▸ </w:t>
@@ -2437,7 +2532,7 @@
         <w:rPr>
           <w:b/>
           <w:i w:val="0"/>
-          <w:color w:val="1B2A4A"/>
+          <w:color w:val="111111"/>
           <w:sz w:val="21"/>
         </w:rPr>
         <w:t>físicos</w:t>
@@ -2462,7 +2557,7 @@
         <w:rPr>
           <w:b/>
           <w:i w:val="0"/>
-          <w:color w:val="B8862B"/>
+          <w:color w:val="C98F00"/>
           <w:sz w:val="20"/>
         </w:rPr>
         <w:t xml:space="preserve">▸ </w:t>
@@ -2480,7 +2575,7 @@
         <w:rPr>
           <w:b/>
           <w:i w:val="0"/>
-          <w:color w:val="1B2A4A"/>
+          <w:color w:val="111111"/>
           <w:sz w:val="21"/>
         </w:rPr>
         <w:t>flui</w:t>
@@ -2498,7 +2593,7 @@
         <w:rPr>
           <w:b/>
           <w:i w:val="0"/>
-          <w:color w:val="1B2A4A"/>
+          <w:color w:val="111111"/>
           <w:sz w:val="21"/>
         </w:rPr>
         <w:t>circula</w:t>
@@ -2523,7 +2618,7 @@
         <w:rPr>
           <w:b/>
           <w:i w:val="0"/>
-          <w:color w:val="B8862B"/>
+          <w:color w:val="C98F00"/>
           <w:sz w:val="20"/>
         </w:rPr>
         <w:t xml:space="preserve">▸ </w:t>
@@ -2541,7 +2636,7 @@
         <w:rPr>
           <w:b/>
           <w:i w:val="0"/>
-          <w:color w:val="1B2A4A"/>
+          <w:color w:val="111111"/>
           <w:sz w:val="21"/>
         </w:rPr>
         <w:t>luminosa → química</w:t>
@@ -2559,7 +2654,7 @@
         <w:rPr>
           <w:b/>
           <w:i w:val="0"/>
-          <w:color w:val="1B2A4A"/>
+          <w:color w:val="111111"/>
           <w:sz w:val="21"/>
         </w:rPr>
         <w:t>química → ATP + calor</w:t>
@@ -2584,7 +2679,7 @@
         <w:rPr>
           <w:b/>
           <w:i w:val="0"/>
-          <w:color w:val="B8862B"/>
+          <w:color w:val="C98F00"/>
           <w:sz w:val="20"/>
         </w:rPr>
         <w:t xml:space="preserve">▸ </w:t>
@@ -2602,7 +2697,7 @@
         <w:rPr>
           <w:b/>
           <w:i w:val="0"/>
-          <w:color w:val="1B2A4A"/>
+          <w:color w:val="111111"/>
           <w:sz w:val="21"/>
         </w:rPr>
         <w:t>4</w:t>
@@ -2636,14 +2731,14 @@
         <w:tc>
           <w:tcPr>
             <w:tcW w:type="dxa" w:w="9638"/>
-            <w:shd w:val="clear" w:color="auto" w:fill="1B2A4A"/>
+            <w:shd w:val="clear" w:color="auto" w:fill="111111"/>
           </w:tcPr>
           <w:p>
             <w:r>
               <w:rPr>
                 <w:b/>
                 <w:i w:val="0"/>
-                <w:color w:val="FFFFFF"/>
+                <w:color w:val="FDB404"/>
                 <w:sz w:val="26"/>
               </w:rPr>
               <w:t>🎯 IMPORTÂNCIA PARA A PROVA</w:t>
@@ -2676,7 +2771,7 @@
         <w:rPr>
           <w:b/>
           <w:i w:val="0"/>
-          <w:color w:val="1B2A4A"/>
+          <w:color w:val="111111"/>
           <w:sz w:val="21"/>
         </w:rPr>
         <w:t>situações do cotidiano</w:t>
@@ -2710,14 +2805,14 @@
         <w:tc>
           <w:tcPr>
             <w:tcW w:type="dxa" w:w="9638"/>
-            <w:shd w:val="clear" w:color="auto" w:fill="1B2A4A"/>
+            <w:shd w:val="clear" w:color="auto" w:fill="111111"/>
           </w:tcPr>
           <w:p>
             <w:r>
               <w:rPr>
                 <w:b/>
                 <w:i w:val="0"/>
-                <w:color w:val="FFFFFF"/>
+                <w:color w:val="FDB404"/>
                 <w:sz w:val="26"/>
               </w:rPr>
               <w:t>📋 RESUMO ESQUEMÁTICO</w:t>
@@ -2748,14 +2843,14 @@
         <w:tc>
           <w:tcPr>
             <w:tcW w:type="dxa" w:w="3213"/>
-            <w:shd w:val="clear" w:color="auto" w:fill="1B2A4A"/>
+            <w:shd w:val="clear" w:color="auto" w:fill="111111"/>
           </w:tcPr>
           <w:p>
             <w:r>
               <w:rPr>
                 <w:b/>
                 <w:i w:val="0"/>
-                <w:color w:val="FFFFFF"/>
+                <w:color w:val="FDB404"/>
                 <w:sz w:val="19"/>
               </w:rPr>
               <w:t>Princípio</w:t>
@@ -2765,14 +2860,14 @@
         <w:tc>
           <w:tcPr>
             <w:tcW w:type="dxa" w:w="3213"/>
-            <w:shd w:val="clear" w:color="auto" w:fill="1B2A4A"/>
+            <w:shd w:val="clear" w:color="auto" w:fill="111111"/>
           </w:tcPr>
           <w:p>
             <w:r>
               <w:rPr>
                 <w:b/>
                 <w:i w:val="0"/>
-                <w:color w:val="FFFFFF"/>
+                <w:color w:val="FDB404"/>
                 <w:sz w:val="19"/>
               </w:rPr>
               <w:t>Enunciado</w:t>
@@ -2782,14 +2877,14 @@
         <w:tc>
           <w:tcPr>
             <w:tcW w:type="dxa" w:w="3213"/>
-            <w:shd w:val="clear" w:color="auto" w:fill="1B2A4A"/>
+            <w:shd w:val="clear" w:color="auto" w:fill="111111"/>
           </w:tcPr>
           <w:p>
             <w:r>
               <w:rPr>
                 <w:b/>
                 <w:i w:val="0"/>
-                <w:color w:val="FFFFFF"/>
+                <w:color w:val="FDB404"/>
                 <w:sz w:val="19"/>
               </w:rPr>
               <w:t>Aplicação</w:t>
@@ -2807,7 +2902,7 @@
               <w:rPr>
                 <w:b/>
                 <w:i w:val="0"/>
-                <w:color w:val="1B2A4A"/>
+                <w:color w:val="111111"/>
                 <w:sz w:val="19"/>
               </w:rPr>
               <w:t>Conservação da energia</w:t>
@@ -2851,14 +2946,14 @@
         <w:tc>
           <w:tcPr>
             <w:tcW w:type="dxa" w:w="3213"/>
-            <w:shd w:val="clear" w:color="auto" w:fill="E8EDF5"/>
+            <w:shd w:val="clear" w:color="auto" w:fill="F2F2F2"/>
           </w:tcPr>
           <w:p>
             <w:r>
               <w:rPr>
                 <w:b/>
                 <w:i w:val="0"/>
-                <w:color w:val="1B2A4A"/>
+                <w:color w:val="111111"/>
                 <w:sz w:val="19"/>
               </w:rPr>
               <w:t>Conservação da massa</w:t>
@@ -2868,7 +2963,7 @@
         <w:tc>
           <w:tcPr>
             <w:tcW w:type="dxa" w:w="3213"/>
-            <w:shd w:val="clear" w:color="auto" w:fill="E8EDF5"/>
+            <w:shd w:val="clear" w:color="auto" w:fill="F2F2F2"/>
           </w:tcPr>
           <w:p>
             <w:r>
@@ -2885,7 +2980,7 @@
         <w:tc>
           <w:tcPr>
             <w:tcW w:type="dxa" w:w="3213"/>
-            <w:shd w:val="clear" w:color="auto" w:fill="E8EDF5"/>
+            <w:shd w:val="clear" w:color="auto" w:fill="F2F2F2"/>
           </w:tcPr>
           <w:p>
             <w:r>
@@ -2910,7 +3005,7 @@
               <w:rPr>
                 <w:b/>
                 <w:i w:val="0"/>
-                <w:color w:val="1B2A4A"/>
+                <w:color w:val="111111"/>
                 <w:sz w:val="19"/>
               </w:rPr>
               <w:t>Teoria celular</w:t>
@@ -2954,14 +3049,14 @@
         <w:tc>
           <w:tcPr>
             <w:tcW w:type="dxa" w:w="3213"/>
-            <w:shd w:val="clear" w:color="auto" w:fill="E8EDF5"/>
+            <w:shd w:val="clear" w:color="auto" w:fill="F2F2F2"/>
           </w:tcPr>
           <w:p>
             <w:r>
               <w:rPr>
                 <w:b/>
                 <w:i w:val="0"/>
-                <w:color w:val="1B2A4A"/>
+                <w:color w:val="111111"/>
                 <w:sz w:val="19"/>
               </w:rPr>
               <w:t>Fluxo de energia</w:t>
@@ -2971,7 +3066,7 @@
         <w:tc>
           <w:tcPr>
             <w:tcW w:type="dxa" w:w="3213"/>
-            <w:shd w:val="clear" w:color="auto" w:fill="E8EDF5"/>
+            <w:shd w:val="clear" w:color="auto" w:fill="F2F2F2"/>
           </w:tcPr>
           <w:p>
             <w:r>
@@ -2988,7 +3083,7 @@
         <w:tc>
           <w:tcPr>
             <w:tcW w:type="dxa" w:w="3213"/>
-            <w:shd w:val="clear" w:color="auto" w:fill="E8EDF5"/>
+            <w:shd w:val="clear" w:color="auto" w:fill="F2F2F2"/>
           </w:tcPr>
           <w:p>
             <w:r>
@@ -3013,7 +3108,7 @@
               <w:rPr>
                 <w:b/>
                 <w:i w:val="0"/>
-                <w:color w:val="1B2A4A"/>
+                <w:color w:val="111111"/>
                 <w:sz w:val="19"/>
               </w:rPr>
               <w:t>Ciclo da matéria</w:t>
@@ -3057,14 +3152,14 @@
         <w:tc>
           <w:tcPr>
             <w:tcW w:type="dxa" w:w="3213"/>
-            <w:shd w:val="clear" w:color="auto" w:fill="E8EDF5"/>
+            <w:shd w:val="clear" w:color="auto" w:fill="F2F2F2"/>
           </w:tcPr>
           <w:p>
             <w:r>
               <w:rPr>
                 <w:b/>
                 <w:i w:val="0"/>
-                <w:color w:val="1B2A4A"/>
+                <w:color w:val="111111"/>
                 <w:sz w:val="19"/>
               </w:rPr>
               <w:t>Tetraedro do fogo</w:t>
@@ -3074,7 +3169,7 @@
         <w:tc>
           <w:tcPr>
             <w:tcW w:type="dxa" w:w="3213"/>
-            <w:shd w:val="clear" w:color="auto" w:fill="E8EDF5"/>
+            <w:shd w:val="clear" w:color="auto" w:fill="F2F2F2"/>
           </w:tcPr>
           <w:p>
             <w:r>
@@ -3091,7 +3186,7 @@
         <w:tc>
           <w:tcPr>
             <w:tcW w:type="dxa" w:w="3213"/>
-            <w:shd w:val="clear" w:color="auto" w:fill="E8EDF5"/>
+            <w:shd w:val="clear" w:color="auto" w:fill="F2F2F2"/>
           </w:tcPr>
           <w:p>
             <w:r>
@@ -3132,14 +3227,14 @@
         <w:tc>
           <w:tcPr>
             <w:tcW w:type="dxa" w:w="9638"/>
-            <w:shd w:val="clear" w:color="auto" w:fill="1B2A4A"/>
+            <w:shd w:val="clear" w:color="auto" w:fill="111111"/>
           </w:tcPr>
           <w:p>
             <w:r>
               <w:rPr>
                 <w:b/>
                 <w:i w:val="0"/>
-                <w:color w:val="FFFFFF"/>
+                <w:color w:val="FDB404"/>
                 <w:sz w:val="26"/>
               </w:rPr>
               <w:t>✨ DICA FINAL</w:t>
@@ -3166,7 +3261,7 @@
         <w:tc>
           <w:tcPr>
             <w:tcW w:type="dxa" w:w="9638"/>
-            <w:shd w:val="clear" w:color="auto" w:fill="F6EBD3"/>
+            <w:shd w:val="clear" w:color="auto" w:fill="FFF3D1"/>
           </w:tcPr>
           <w:p>
             <w:r>
@@ -3182,7 +3277,7 @@
               <w:rPr>
                 <w:b/>
                 <w:i/>
-                <w:color w:val="1B2A4A"/>
+                <w:color w:val="111111"/>
                 <w:sz w:val="22"/>
               </w:rPr>
               <w:t>que matéria está envolvida? Que energia se transforma? Há ser vivo afetado?</w:t>
@@ -3230,14 +3325,14 @@
         <w:tc>
           <w:tcPr>
             <w:tcW w:type="dxa" w:w="9638"/>
-            <w:shd w:val="clear" w:color="auto" w:fill="1B2A4A"/>
+            <w:shd w:val="clear" w:color="auto" w:fill="111111"/>
           </w:tcPr>
           <w:p>
             <w:r>
               <w:rPr>
                 <w:b/>
                 <w:i w:val="0"/>
-                <w:color w:val="FFFFFF"/>
+                <w:color w:val="FDB404"/>
                 <w:sz w:val="26"/>
               </w:rPr>
               <w:t>📝 QUESTÕES DE FIXAÇÃO</w:t>
@@ -3264,14 +3359,17 @@
         <w:tc>
           <w:tcPr>
             <w:tcW w:type="dxa" w:w="9638"/>
-            <w:shd w:val="clear" w:color="auto" w:fill="1B2A4A"/>
+            <w:shd w:val="clear" w:color="auto" w:fill="111111"/>
           </w:tcPr>
           <w:p>
+            <w:pPr>
+              <w:keepNext/>
+            </w:pPr>
             <w:r>
               <w:rPr>
                 <w:b/>
                 <w:i w:val="0"/>
-                <w:color w:val="FFFFFF"/>
+                <w:color w:val="FDB404"/>
                 <w:sz w:val="22"/>
               </w:rPr>
               <w:t>QUESTÃO 01</w:t>
@@ -3305,7 +3403,7 @@
         <w:rPr>
           <w:b/>
           <w:i w:val="0"/>
-          <w:color w:val="1B2A4A"/>
+          <w:color w:val="111111"/>
           <w:sz w:val="20"/>
         </w:rPr>
         <w:t xml:space="preserve">(A) </w:t>
@@ -3330,7 +3428,7 @@
         <w:rPr>
           <w:b/>
           <w:i w:val="0"/>
-          <w:color w:val="1B2A4A"/>
+          <w:color w:val="111111"/>
           <w:sz w:val="20"/>
         </w:rPr>
         <w:t xml:space="preserve">(B) </w:t>
@@ -3355,7 +3453,7 @@
         <w:rPr>
           <w:b/>
           <w:i w:val="0"/>
-          <w:color w:val="1B2A4A"/>
+          <w:color w:val="111111"/>
           <w:sz w:val="20"/>
         </w:rPr>
         <w:t xml:space="preserve">(C) </w:t>
@@ -3380,7 +3478,7 @@
         <w:rPr>
           <w:b/>
           <w:i w:val="0"/>
-          <w:color w:val="1B2A4A"/>
+          <w:color w:val="111111"/>
           <w:sz w:val="20"/>
         </w:rPr>
         <w:t xml:space="preserve">(D) </w:t>
@@ -3405,7 +3503,7 @@
         <w:rPr>
           <w:b/>
           <w:i w:val="0"/>
-          <w:color w:val="1B2A4A"/>
+          <w:color w:val="111111"/>
           <w:sz w:val="20"/>
         </w:rPr>
         <w:t xml:space="preserve">(E) </w:t>
@@ -3432,7 +3530,7 @@
         <w:tc>
           <w:tcPr>
             <w:tcW w:type="dxa" w:w="9638"/>
-            <w:shd w:val="clear" w:color="auto" w:fill="F6EBD3"/>
+            <w:shd w:val="clear" w:color="auto" w:fill="FFF3D1"/>
           </w:tcPr>
           <w:p>
             <w:r>
@@ -3450,7 +3548,7 @@
               <w:rPr>
                 <w:b/>
                 <w:i w:val="0"/>
-                <w:color w:val="1B2A4A"/>
+                <w:color w:val="111111"/>
                 <w:sz w:val="20"/>
               </w:rPr>
               <w:t>Comentário:</w:t>
@@ -3486,14 +3584,17 @@
         <w:tc>
           <w:tcPr>
             <w:tcW w:type="dxa" w:w="9638"/>
-            <w:shd w:val="clear" w:color="auto" w:fill="1B2A4A"/>
+            <w:shd w:val="clear" w:color="auto" w:fill="111111"/>
           </w:tcPr>
           <w:p>
+            <w:pPr>
+              <w:keepNext/>
+            </w:pPr>
             <w:r>
               <w:rPr>
                 <w:b/>
                 <w:i w:val="0"/>
-                <w:color w:val="FFFFFF"/>
+                <w:color w:val="FDB404"/>
                 <w:sz w:val="22"/>
               </w:rPr>
               <w:t>QUESTÃO 02</w:t>
@@ -3527,7 +3628,7 @@
         <w:rPr>
           <w:b/>
           <w:i w:val="0"/>
-          <w:color w:val="1B2A4A"/>
+          <w:color w:val="111111"/>
           <w:sz w:val="20"/>
         </w:rPr>
         <w:t xml:space="preserve">(A) </w:t>
@@ -3552,7 +3653,7 @@
         <w:rPr>
           <w:b/>
           <w:i w:val="0"/>
-          <w:color w:val="1B2A4A"/>
+          <w:color w:val="111111"/>
           <w:sz w:val="20"/>
         </w:rPr>
         <w:t xml:space="preserve">(B) </w:t>
@@ -3577,7 +3678,7 @@
         <w:rPr>
           <w:b/>
           <w:i w:val="0"/>
-          <w:color w:val="1B2A4A"/>
+          <w:color w:val="111111"/>
           <w:sz w:val="20"/>
         </w:rPr>
         <w:t xml:space="preserve">(C) </w:t>
@@ -3602,7 +3703,7 @@
         <w:rPr>
           <w:b/>
           <w:i w:val="0"/>
-          <w:color w:val="1B2A4A"/>
+          <w:color w:val="111111"/>
           <w:sz w:val="20"/>
         </w:rPr>
         <w:t xml:space="preserve">(D) </w:t>
@@ -3627,7 +3728,7 @@
         <w:rPr>
           <w:b/>
           <w:i w:val="0"/>
-          <w:color w:val="1B2A4A"/>
+          <w:color w:val="111111"/>
           <w:sz w:val="20"/>
         </w:rPr>
         <w:t xml:space="preserve">(E) </w:t>
@@ -3654,7 +3755,7 @@
         <w:tc>
           <w:tcPr>
             <w:tcW w:type="dxa" w:w="9638"/>
-            <w:shd w:val="clear" w:color="auto" w:fill="F6EBD3"/>
+            <w:shd w:val="clear" w:color="auto" w:fill="FFF3D1"/>
           </w:tcPr>
           <w:p>
             <w:r>
@@ -3672,7 +3773,7 @@
               <w:rPr>
                 <w:b/>
                 <w:i w:val="0"/>
-                <w:color w:val="1B2A4A"/>
+                <w:color w:val="111111"/>
                 <w:sz w:val="20"/>
               </w:rPr>
               <w:t>Comentário:</w:t>
@@ -3708,14 +3809,17 @@
         <w:tc>
           <w:tcPr>
             <w:tcW w:type="dxa" w:w="9638"/>
-            <w:shd w:val="clear" w:color="auto" w:fill="1B2A4A"/>
+            <w:shd w:val="clear" w:color="auto" w:fill="111111"/>
           </w:tcPr>
           <w:p>
+            <w:pPr>
+              <w:keepNext/>
+            </w:pPr>
             <w:r>
               <w:rPr>
                 <w:b/>
                 <w:i w:val="0"/>
-                <w:color w:val="FFFFFF"/>
+                <w:color w:val="FDB404"/>
                 <w:sz w:val="22"/>
               </w:rPr>
               <w:t>QUESTÃO 03</w:t>
@@ -3749,7 +3853,7 @@
         <w:rPr>
           <w:b/>
           <w:i w:val="0"/>
-          <w:color w:val="1B2A4A"/>
+          <w:color w:val="111111"/>
           <w:sz w:val="20"/>
         </w:rPr>
         <w:t xml:space="preserve">(A) </w:t>
@@ -3774,7 +3878,7 @@
         <w:rPr>
           <w:b/>
           <w:i w:val="0"/>
-          <w:color w:val="1B2A4A"/>
+          <w:color w:val="111111"/>
           <w:sz w:val="20"/>
         </w:rPr>
         <w:t xml:space="preserve">(B) </w:t>
@@ -3799,7 +3903,7 @@
         <w:rPr>
           <w:b/>
           <w:i w:val="0"/>
-          <w:color w:val="1B2A4A"/>
+          <w:color w:val="111111"/>
           <w:sz w:val="20"/>
         </w:rPr>
         <w:t xml:space="preserve">(C) </w:t>
@@ -3824,7 +3928,7 @@
         <w:rPr>
           <w:b/>
           <w:i w:val="0"/>
-          <w:color w:val="1B2A4A"/>
+          <w:color w:val="111111"/>
           <w:sz w:val="20"/>
         </w:rPr>
         <w:t xml:space="preserve">(D) </w:t>
@@ -3849,7 +3953,7 @@
         <w:rPr>
           <w:b/>
           <w:i w:val="0"/>
-          <w:color w:val="1B2A4A"/>
+          <w:color w:val="111111"/>
           <w:sz w:val="20"/>
         </w:rPr>
         <w:t xml:space="preserve">(E) </w:t>
@@ -3876,7 +3980,7 @@
         <w:tc>
           <w:tcPr>
             <w:tcW w:type="dxa" w:w="9638"/>
-            <w:shd w:val="clear" w:color="auto" w:fill="F6EBD3"/>
+            <w:shd w:val="clear" w:color="auto" w:fill="FFF3D1"/>
           </w:tcPr>
           <w:p>
             <w:r>
@@ -3894,7 +3998,7 @@
               <w:rPr>
                 <w:b/>
                 <w:i w:val="0"/>
-                <w:color w:val="1B2A4A"/>
+                <w:color w:val="111111"/>
                 <w:sz w:val="20"/>
               </w:rPr>
               <w:t>Comentário:</w:t>
@@ -3930,14 +4034,17 @@
         <w:tc>
           <w:tcPr>
             <w:tcW w:type="dxa" w:w="9638"/>
-            <w:shd w:val="clear" w:color="auto" w:fill="1B2A4A"/>
+            <w:shd w:val="clear" w:color="auto" w:fill="111111"/>
           </w:tcPr>
           <w:p>
+            <w:pPr>
+              <w:keepNext/>
+            </w:pPr>
             <w:r>
               <w:rPr>
                 <w:b/>
                 <w:i w:val="0"/>
-                <w:color w:val="FFFFFF"/>
+                <w:color w:val="FDB404"/>
                 <w:sz w:val="22"/>
               </w:rPr>
               <w:t>QUESTÃO 04</w:t>
@@ -3973,7 +4080,7 @@
         <w:tc>
           <w:tcPr>
             <w:tcW w:type="dxa" w:w="9638"/>
-            <w:shd w:val="clear" w:color="auto" w:fill="F6EBD3"/>
+            <w:shd w:val="clear" w:color="auto" w:fill="FFF3D1"/>
           </w:tcPr>
           <w:p>
             <w:r>
@@ -3991,7 +4098,7 @@
               <w:rPr>
                 <w:b/>
                 <w:i w:val="0"/>
-                <w:color w:val="1B2A4A"/>
+                <w:color w:val="111111"/>
                 <w:sz w:val="20"/>
               </w:rPr>
               <w:t>Comentário:</w:t>
@@ -4027,14 +4134,17 @@
         <w:tc>
           <w:tcPr>
             <w:tcW w:type="dxa" w:w="9638"/>
-            <w:shd w:val="clear" w:color="auto" w:fill="1B2A4A"/>
+            <w:shd w:val="clear" w:color="auto" w:fill="111111"/>
           </w:tcPr>
           <w:p>
+            <w:pPr>
+              <w:keepNext/>
+            </w:pPr>
             <w:r>
               <w:rPr>
                 <w:b/>
                 <w:i w:val="0"/>
-                <w:color w:val="FFFFFF"/>
+                <w:color w:val="FDB404"/>
                 <w:sz w:val="22"/>
               </w:rPr>
               <w:t>QUESTÃO 05</w:t>
@@ -4068,7 +4178,7 @@
         <w:rPr>
           <w:b/>
           <w:i w:val="0"/>
-          <w:color w:val="1B2A4A"/>
+          <w:color w:val="111111"/>
           <w:sz w:val="20"/>
         </w:rPr>
         <w:t xml:space="preserve">(A) </w:t>
@@ -4093,7 +4203,7 @@
         <w:rPr>
           <w:b/>
           <w:i w:val="0"/>
-          <w:color w:val="1B2A4A"/>
+          <w:color w:val="111111"/>
           <w:sz w:val="20"/>
         </w:rPr>
         <w:t xml:space="preserve">(B) </w:t>
@@ -4118,7 +4228,7 @@
         <w:rPr>
           <w:b/>
           <w:i w:val="0"/>
-          <w:color w:val="1B2A4A"/>
+          <w:color w:val="111111"/>
           <w:sz w:val="20"/>
         </w:rPr>
         <w:t xml:space="preserve">(C) </w:t>
@@ -4143,7 +4253,7 @@
         <w:rPr>
           <w:b/>
           <w:i w:val="0"/>
-          <w:color w:val="1B2A4A"/>
+          <w:color w:val="111111"/>
           <w:sz w:val="20"/>
         </w:rPr>
         <w:t xml:space="preserve">(D) </w:t>
@@ -4168,7 +4278,7 @@
         <w:rPr>
           <w:b/>
           <w:i w:val="0"/>
-          <w:color w:val="1B2A4A"/>
+          <w:color w:val="111111"/>
           <w:sz w:val="20"/>
         </w:rPr>
         <w:t xml:space="preserve">(E) </w:t>
@@ -4195,7 +4305,7 @@
         <w:tc>
           <w:tcPr>
             <w:tcW w:type="dxa" w:w="9638"/>
-            <w:shd w:val="clear" w:color="auto" w:fill="F6EBD3"/>
+            <w:shd w:val="clear" w:color="auto" w:fill="FFF3D1"/>
           </w:tcPr>
           <w:p>
             <w:r>
@@ -4213,7 +4323,7 @@
               <w:rPr>
                 <w:b/>
                 <w:i w:val="0"/>
-                <w:color w:val="1B2A4A"/>
+                <w:color w:val="111111"/>
                 <w:sz w:val="20"/>
               </w:rPr>
               <w:t>Comentário:</w:t>

</xml_diff>